<commit_message>
Tie QA defects to use cases and document missing diagram
</commit_message>
<xml_diff>
--- a/outputs/iteration-2/iteration-2-bug-report.docx
+++ b/outputs/iteration-2/iteration-2-bug-report.docx
@@ -464,7 +464,7 @@
           </w:tcPr>
           <w:p>
             <w:r>
-              <w:t>BUG-001</w:t>
+              <w:t>UC-002-BUG-001</w:t>
             </w:r>
           </w:p>
         </w:tc>
@@ -532,7 +532,7 @@
           </w:tcPr>
           <w:p>
             <w:r>
-              <w:t>BUG-002</w:t>
+              <w:t>UC-003-BUG-001</w:t>
             </w:r>
           </w:p>
         </w:tc>
@@ -600,7 +600,7 @@
           </w:tcPr>
           <w:p>
             <w:r>
-              <w:t>BUG-003</w:t>
+              <w:t>UC-003-BUG-002</w:t>
             </w:r>
           </w:p>
         </w:tc>
@@ -668,7 +668,7 @@
           </w:tcPr>
           <w:p>
             <w:r>
-              <w:t>BUG-004</w:t>
+              <w:t>UC-002-BUG-002</w:t>
             </w:r>
           </w:p>
         </w:tc>
@@ -736,7 +736,7 @@
           </w:tcPr>
           <w:p>
             <w:r>
-              <w:t>BUG-006</w:t>
+              <w:t>UC-001-BUG-001</w:t>
             </w:r>
           </w:p>
         </w:tc>
@@ -804,7 +804,7 @@
           </w:tcPr>
           <w:p>
             <w:r>
-              <w:t>BUG-007</w:t>
+              <w:t>SETUP-BUG-001</w:t>
             </w:r>
           </w:p>
         </w:tc>
@@ -872,7 +872,7 @@
           </w:tcPr>
           <w:p>
             <w:r>
-              <w:t>BUG-008</w:t>
+              <w:t>UC-004-BUG-001</w:t>
             </w:r>
           </w:p>
         </w:tc>
@@ -949,7 +949,7 @@
         <w:keepNext/>
       </w:pPr>
       <w:r>
-        <w:t>BUG-001  Invoice PDF</w:t>
+        <w:t>UC-002-BUG-001  Invoice PDF</w:t>
       </w:r>
     </w:p>
     <w:tbl>
@@ -1029,7 +1029,7 @@
           </w:tcPr>
           <w:p>
             <w:r>
-              <w:t>BUG-001</w:t>
+              <w:t>UC-002-BUG-001</w:t>
             </w:r>
           </w:p>
         </w:tc>
@@ -1538,7 +1538,7 @@
         <w:pageBreakBefore/>
       </w:pPr>
       <w:r>
-        <w:t>BUG-002  Checkout loses guest count, date and total</w:t>
+        <w:t>UC-003-BUG-001  Checkout loses guest count, date and total</w:t>
       </w:r>
     </w:p>
     <w:tbl>
@@ -1618,7 +1618,7 @@
           </w:tcPr>
           <w:p>
             <w:r>
-              <w:t>BUG-002</w:t>
+              <w:t>UC-003-BUG-001</w:t>
             </w:r>
           </w:p>
         </w:tc>
@@ -2126,7 +2126,7 @@
         <w:pageBreakBefore/>
       </w:pPr>
       <w:r>
-        <w:t>BUG-003  Dashboard shows a sample booking instead of the customer's booking</w:t>
+        <w:t>UC-003-BUG-002  Dashboard shows a sample booking instead of the customer's booking</w:t>
       </w:r>
     </w:p>
     <w:tbl>
@@ -2206,7 +2206,7 @@
           </w:tcPr>
           <w:p>
             <w:r>
-              <w:t>BUG-003</w:t>
+              <w:t>UC-003-BUG-002</w:t>
             </w:r>
           </w:p>
         </w:tc>
@@ -2714,7 +2714,7 @@
         <w:pageBreakBefore/>
       </w:pPr>
       <w:r>
-        <w:t>BUG-004  Old simulated card form accepts malformed nonempty values</w:t>
+        <w:t>UC-002-BUG-002  Old simulated card form accepts malformed nonempty values</w:t>
       </w:r>
     </w:p>
     <w:tbl>
@@ -2794,7 +2794,7 @@
           </w:tcPr>
           <w:p>
             <w:r>
-              <w:t>BUG-004</w:t>
+              <w:t>UC-002-BUG-002</w:t>
             </w:r>
           </w:p>
         </w:tc>
@@ -3302,7 +3302,7 @@
         <w:pageBreakBefore/>
       </w:pPr>
       <w:r>
-        <w:t>BUG-006  Booking accepts a past tour date</w:t>
+        <w:t>UC-001-BUG-001  Booking accepts a past tour date</w:t>
       </w:r>
     </w:p>
     <w:tbl>
@@ -3382,7 +3382,7 @@
           </w:tcPr>
           <w:p>
             <w:r>
-              <w:t>BUG-006</w:t>
+              <w:t>UC-001-BUG-001</w:t>
             </w:r>
           </w:p>
         </w:tc>
@@ -3890,7 +3890,7 @@
         <w:pageBreakBefore/>
       </w:pPr>
       <w:r>
-        <w:t>BUG-007  Clean Windows dependency install fails</w:t>
+        <w:t>SETUP-BUG-001  Clean Windows dependency install fails</w:t>
       </w:r>
     </w:p>
     <w:tbl>
@@ -3970,7 +3970,7 @@
           </w:tcPr>
           <w:p>
             <w:r>
-              <w:t>BUG-007</w:t>
+              <w:t>SETUP-BUG-001</w:t>
             </w:r>
           </w:p>
         </w:tc>
@@ -4478,7 +4478,7 @@
         <w:pageBreakBefore/>
       </w:pPr>
       <w:r>
-        <w:t>BUG-008  Quotation page raises a hydration runtime error</w:t>
+        <w:t>UC-004-BUG-001  Quotation page raises a hydration runtime error</w:t>
       </w:r>
     </w:p>
     <w:tbl>
@@ -4558,7 +4558,7 @@
           </w:tcPr>
           <w:p>
             <w:r>
-              <w:t>BUG-008</w:t>
+              <w:t>UC-004-BUG-001</w:t>
             </w:r>
           </w:p>
         </w:tc>
@@ -5070,12 +5070,12 @@
     </w:p>
     <w:p>
       <w:r>
-        <w:t>Prioritize the booking data defects BUG-002 and BUG-003 because the customer sees a different booking after checkout. Repair BUG-001 and retest PDF download and contents. Retest the other findings against the newer official version in Iteration 3. The old card-field test for BUG-004 must be replaced with gateway sandbox checks because the new version removed that form.</w:t>
+        <w:t>Prioritize UC-003-BUG-001 and UC-003-BUG-002 because the customer sees a different booking after checkout. Repair UC-002-BUG-001 and retest PDF download and contents. Retest the other findings against the newer official version in Iteration 3. The old card-field test for UC-002-BUG-002 must be replaced with gateway sandbox checks because the new version removed that form.</w:t>
       </w:r>
     </w:p>
     <w:p>
       <w:r>
-        <w:t>BUG-009 is a quotation record scope clarification, and BUG-005 was an observation about unused Supabase code in the tested baseline. Neither is counted among the seven confirmed defects. The newer checkout code has not been included in these Iteration 2 results.</w:t>
+        <w:t>UC-004-SCOPE-001 is a quotation record scope clarification, and OBS-001 was an observation about unused Supabase code in the tested baseline. Neither is counted among the seven confirmed defects. The newer checkout code has not been included in these Iteration 2 results.</w:t>
       </w:r>
     </w:p>
     <w:sectPr>

</xml_diff>